<commit_message>
update examples, justfiles and lua filter
</commit_message>
<xml_diff>
--- a/utils/Dummy_Book_Template_Table_Header.docx
+++ b/utils/Dummy_Book_Template_Table_Header.docx
@@ -5,19 +5,17 @@
     <w:tbl>
       <w:tblPr>
         <w:tblStyle w:val="Tabellenraster"/>
-        <w:tblW w:w="0" w:type="auto"/>
+        <w:tblW w:w="9067" w:type="dxa"/>
         <w:tblLook w:val="04A0" w:firstRow="1" w:lastRow="0" w:firstColumn="1" w:lastColumn="0" w:noHBand="0" w:noVBand="1"/>
       </w:tblPr>
       <w:tblGrid>
         <w:gridCol w:w="1982"/>
-        <w:gridCol w:w="4104"/>
-        <w:gridCol w:w="1488"/>
-        <w:gridCol w:w="1488"/>
+        <w:gridCol w:w="7085"/>
       </w:tblGrid>
       <w:tr>
         <w:tc>
           <w:tcPr>
-            <w:tcW w:w="2265" w:type="dxa"/>
+            <w:tcW w:w="1982" w:type="dxa"/>
           </w:tcPr>
           <w:p>
             <w:pPr>
@@ -34,7 +32,7 @@
         </w:tc>
         <w:tc>
           <w:tcPr>
-            <w:tcW w:w="2265" w:type="dxa"/>
+            <w:tcW w:w="7085" w:type="dxa"/>
           </w:tcPr>
           <w:p>
             <w:pPr>
@@ -54,48 +52,36 @@
             </w:r>
           </w:p>
         </w:tc>
+      </w:tr>
+      <w:tr>
         <w:tc>
           <w:tcPr>
-            <w:tcW w:w="2266" w:type="dxa"/>
+            <w:tcW w:w="1982" w:type="dxa"/>
           </w:tcPr>
           <w:p>
             <w:pPr>
               <w:pStyle w:val="berschrift1"/>
               <w:outlineLvl w:val="0"/>
             </w:pPr>
+            <w:proofErr w:type="spellStart"/>
+            <w:r>
+              <w:t>B</w:t>
+            </w:r>
+            <w:r>
+              <w:t>ook</w:t>
+            </w:r>
+            <w:r>
+              <w:t>T</w:t>
+            </w:r>
+            <w:r>
+              <w:t>itle</w:t>
+            </w:r>
+            <w:proofErr w:type="spellEnd"/>
           </w:p>
         </w:tc>
         <w:tc>
           <w:tcPr>
-            <w:tcW w:w="2266" w:type="dxa"/>
-          </w:tcPr>
-          <w:p>
-            <w:pPr>
-              <w:pStyle w:val="berschrift1"/>
-              <w:outlineLvl w:val="0"/>
-            </w:pPr>
-          </w:p>
-        </w:tc>
-      </w:tr>
-      <w:tr>
-        <w:tc>
-          <w:tcPr>
-            <w:tcW w:w="2265" w:type="dxa"/>
-          </w:tcPr>
-          <w:p>
-            <w:pPr>
-              <w:pStyle w:val="berschrift1"/>
-              <w:outlineLvl w:val="0"/>
-            </w:pPr>
-            <w:bookmarkStart w:id="0" w:name="_Toc224054415"/>
-            <w:r>
-              <w:t>Title</w:t>
-            </w:r>
-          </w:p>
-        </w:tc>
-        <w:tc>
-          <w:tcPr>
-            <w:tcW w:w="2265" w:type="dxa"/>
+            <w:tcW w:w="7085" w:type="dxa"/>
           </w:tcPr>
           <w:p>
             <w:pPr>
@@ -112,33 +98,11 @@
             </w:r>
           </w:p>
         </w:tc>
-        <w:tc>
-          <w:tcPr>
-            <w:tcW w:w="2266" w:type="dxa"/>
-          </w:tcPr>
-          <w:p>
-            <w:pPr>
-              <w:pStyle w:val="berschrift1"/>
-              <w:outlineLvl w:val="0"/>
-            </w:pPr>
-          </w:p>
-        </w:tc>
-        <w:tc>
-          <w:tcPr>
-            <w:tcW w:w="2266" w:type="dxa"/>
-          </w:tcPr>
-          <w:p>
-            <w:pPr>
-              <w:pStyle w:val="berschrift1"/>
-              <w:outlineLvl w:val="0"/>
-            </w:pPr>
-          </w:p>
-        </w:tc>
       </w:tr>
       <w:tr>
         <w:tc>
           <w:tcPr>
-            <w:tcW w:w="2265" w:type="dxa"/>
+            <w:tcW w:w="1982" w:type="dxa"/>
           </w:tcPr>
           <w:p>
             <w:pPr>
@@ -154,7 +118,7 @@
         </w:tc>
         <w:tc>
           <w:tcPr>
-            <w:tcW w:w="2265" w:type="dxa"/>
+            <w:tcW w:w="7085" w:type="dxa"/>
           </w:tcPr>
           <w:p>
             <w:pPr>
@@ -170,19 +134,7 @@
               <w:rPr>
                 <w:lang w:val="en-GB"/>
               </w:rPr>
-              <w:t>Anton</w:t>
-            </w:r>
-            <w:r>
-              <w:rPr>
-                <w:lang w:val="en-GB"/>
-              </w:rPr>
-              <w:t>;</w:t>
-            </w:r>
-            <w:r>
-              <w:rPr>
-                <w:lang w:val="en-GB"/>
-              </w:rPr>
-              <w:t>Author</w:t>
+              <w:t>Anton;Author</w:t>
             </w:r>
             <w:proofErr w:type="spellEnd"/>
             <w:proofErr w:type="gramEnd"/>
@@ -190,26 +142,14 @@
               <w:rPr>
                 <w:lang w:val="en-GB"/>
               </w:rPr>
-              <w:t>;</w:t>
-            </w:r>
-            <w:r>
-              <w:rPr>
-                <w:lang w:val="en-GB"/>
-              </w:rPr>
-              <w:t xml:space="preserve"> FU </w:t>
+              <w:t xml:space="preserve">; FU </w:t>
             </w:r>
             <w:proofErr w:type="spellStart"/>
             <w:r>
               <w:rPr>
                 <w:lang w:val="en-GB"/>
               </w:rPr>
-              <w:t>Berlin</w:t>
-            </w:r>
-            <w:r>
-              <w:rPr>
-                <w:lang w:val="en-GB"/>
-              </w:rPr>
-              <w:t>;https</w:t>
+              <w:t>Berlin;https</w:t>
             </w:r>
             <w:proofErr w:type="spellEnd"/>
             <w:r>
@@ -220,39 +160,11 @@
             </w:r>
           </w:p>
         </w:tc>
-        <w:tc>
-          <w:tcPr>
-            <w:tcW w:w="2266" w:type="dxa"/>
-          </w:tcPr>
-          <w:p>
-            <w:pPr>
-              <w:pStyle w:val="berschrift1"/>
-              <w:outlineLvl w:val="0"/>
-              <w:rPr>
-                <w:lang w:val="en-GB"/>
-              </w:rPr>
-            </w:pPr>
-          </w:p>
-        </w:tc>
-        <w:tc>
-          <w:tcPr>
-            <w:tcW w:w="2266" w:type="dxa"/>
-          </w:tcPr>
-          <w:p>
-            <w:pPr>
-              <w:pStyle w:val="berschrift1"/>
-              <w:outlineLvl w:val="0"/>
-              <w:rPr>
-                <w:lang w:val="en-GB"/>
-              </w:rPr>
-            </w:pPr>
-          </w:p>
-        </w:tc>
       </w:tr>
       <w:tr>
         <w:tc>
           <w:tcPr>
-            <w:tcW w:w="2265" w:type="dxa"/>
+            <w:tcW w:w="1982" w:type="dxa"/>
           </w:tcPr>
           <w:p>
             <w:pPr>
@@ -268,7 +180,65 @@
         </w:tc>
         <w:tc>
           <w:tcPr>
-            <w:tcW w:w="2265" w:type="dxa"/>
+            <w:tcW w:w="7085" w:type="dxa"/>
+          </w:tcPr>
+          <w:p>
+            <w:pPr>
+              <w:pStyle w:val="berschrift1"/>
+              <w:outlineLvl w:val="0"/>
+              <w:rPr>
+                <w:lang w:val="en-GB"/>
+              </w:rPr>
+            </w:pPr>
+            <w:r>
+              <w:rPr>
+                <w:lang w:val="en-GB"/>
+              </w:rPr>
+              <w:t>My even better subtitle</w:t>
+            </w:r>
+          </w:p>
+        </w:tc>
+      </w:tr>
+      <w:tr>
+        <w:tc>
+          <w:tcPr>
+            <w:tcW w:w="1982" w:type="dxa"/>
+          </w:tcPr>
+          <w:p>
+            <w:pPr>
+              <w:pStyle w:val="berschrift1"/>
+              <w:outlineLvl w:val="0"/>
+            </w:pPr>
+            <w:r>
+              <w:t>Title</w:t>
+            </w:r>
+          </w:p>
+        </w:tc>
+        <w:tc>
+          <w:tcPr>
+            <w:tcW w:w="7085" w:type="dxa"/>
+          </w:tcPr>
+          <w:p>
+            <w:pPr>
+              <w:pStyle w:val="berschrift1"/>
+              <w:outlineLvl w:val="0"/>
+              <w:rPr>
+                <w:lang w:val="en-GB"/>
+              </w:rPr>
+            </w:pPr>
+            <w:r>
+              <w:rPr>
+                <w:lang w:val="en-GB"/>
+              </w:rPr>
+              <w:t>My Title</w:t>
+            </w:r>
+          </w:p>
+        </w:tc>
+      </w:tr>
+      <w:tr>
+        <w:tc>
+          <w:tcPr>
+            <w:tcW w:w="1982" w:type="dxa"/>
           </w:tcPr>
           <w:p>
             <w:pPr>
@@ -276,194 +246,42 @@
               <w:outlineLvl w:val="0"/>
             </w:pPr>
             <w:proofErr w:type="spellStart"/>
+            <w:proofErr w:type="gramStart"/>
             <w:r>
-              <w:t>My</w:t>
+              <w:t>book.title</w:t>
             </w:r>
             <w:proofErr w:type="spellEnd"/>
-            <w:r>
-              <w:t xml:space="preserve"> </w:t>
-            </w:r>
-            <w:proofErr w:type="spellStart"/>
-            <w:r>
-              <w:t>even</w:t>
-            </w:r>
-            <w:proofErr w:type="spellEnd"/>
-            <w:r>
-              <w:t xml:space="preserve"> </w:t>
-            </w:r>
-            <w:proofErr w:type="spellStart"/>
-            <w:r>
-              <w:t>better</w:t>
-            </w:r>
-            <w:proofErr w:type="spellEnd"/>
-            <w:r>
-              <w:t xml:space="preserve"> </w:t>
-            </w:r>
-            <w:proofErr w:type="spellStart"/>
-            <w:r>
-              <w:t>subtitle</w:t>
-            </w:r>
-            <w:proofErr w:type="spellEnd"/>
+            <w:proofErr w:type="gramEnd"/>
           </w:p>
         </w:tc>
         <w:tc>
           <w:tcPr>
-            <w:tcW w:w="2266" w:type="dxa"/>
+            <w:tcW w:w="7085" w:type="dxa"/>
           </w:tcPr>
           <w:p>
             <w:pPr>
               <w:pStyle w:val="berschrift1"/>
               <w:outlineLvl w:val="0"/>
+              <w:rPr>
+                <w:lang w:val="en-GB"/>
+              </w:rPr>
             </w:pPr>
-          </w:p>
-        </w:tc>
-        <w:tc>
-          <w:tcPr>
-            <w:tcW w:w="2266" w:type="dxa"/>
-          </w:tcPr>
-          <w:p>
-            <w:pPr>
-              <w:pStyle w:val="berschrift1"/>
-              <w:outlineLvl w:val="0"/>
-            </w:pPr>
-          </w:p>
-        </w:tc>
-      </w:tr>
-      <w:tr>
-        <w:tc>
-          <w:tcPr>
-            <w:tcW w:w="2265" w:type="dxa"/>
-          </w:tcPr>
-          <w:p>
-            <w:pPr>
-              <w:pStyle w:val="berschrift1"/>
-              <w:outlineLvl w:val="0"/>
-            </w:pPr>
-          </w:p>
-        </w:tc>
-        <w:tc>
-          <w:tcPr>
-            <w:tcW w:w="2265" w:type="dxa"/>
-          </w:tcPr>
-          <w:p>
-            <w:pPr>
-              <w:pStyle w:val="berschrift1"/>
-              <w:outlineLvl w:val="0"/>
-            </w:pPr>
-          </w:p>
-        </w:tc>
-        <w:tc>
-          <w:tcPr>
-            <w:tcW w:w="2266" w:type="dxa"/>
-          </w:tcPr>
-          <w:p>
-            <w:pPr>
-              <w:pStyle w:val="berschrift1"/>
-              <w:outlineLvl w:val="0"/>
-            </w:pPr>
-          </w:p>
-        </w:tc>
-        <w:tc>
-          <w:tcPr>
-            <w:tcW w:w="2266" w:type="dxa"/>
-          </w:tcPr>
-          <w:p>
-            <w:pPr>
-              <w:pStyle w:val="berschrift1"/>
-              <w:outlineLvl w:val="0"/>
-            </w:pPr>
-          </w:p>
-        </w:tc>
-      </w:tr>
-      <w:tr>
-        <w:tc>
-          <w:tcPr>
-            <w:tcW w:w="2265" w:type="dxa"/>
-          </w:tcPr>
-          <w:p>
-            <w:pPr>
-              <w:pStyle w:val="berschrift1"/>
-              <w:outlineLvl w:val="0"/>
-            </w:pPr>
-          </w:p>
-        </w:tc>
-        <w:tc>
-          <w:tcPr>
-            <w:tcW w:w="2265" w:type="dxa"/>
-          </w:tcPr>
-          <w:p>
-            <w:pPr>
-              <w:pStyle w:val="berschrift1"/>
-              <w:outlineLvl w:val="0"/>
-            </w:pPr>
-          </w:p>
-        </w:tc>
-        <w:tc>
-          <w:tcPr>
-            <w:tcW w:w="2266" w:type="dxa"/>
-          </w:tcPr>
-          <w:p>
-            <w:pPr>
-              <w:pStyle w:val="berschrift1"/>
-              <w:outlineLvl w:val="0"/>
-            </w:pPr>
-          </w:p>
-        </w:tc>
-        <w:tc>
-          <w:tcPr>
-            <w:tcW w:w="2266" w:type="dxa"/>
-          </w:tcPr>
-          <w:p>
-            <w:pPr>
-              <w:pStyle w:val="berschrift1"/>
-              <w:outlineLvl w:val="0"/>
-            </w:pPr>
-          </w:p>
-        </w:tc>
-      </w:tr>
-      <w:tr>
-        <w:tc>
-          <w:tcPr>
-            <w:tcW w:w="2265" w:type="dxa"/>
-          </w:tcPr>
-          <w:p>
-            <w:pPr>
-              <w:pStyle w:val="berschrift1"/>
-              <w:outlineLvl w:val="0"/>
-            </w:pPr>
-          </w:p>
-        </w:tc>
-        <w:tc>
-          <w:tcPr>
-            <w:tcW w:w="2265" w:type="dxa"/>
-          </w:tcPr>
-          <w:p>
-            <w:pPr>
-              <w:pStyle w:val="berschrift1"/>
-              <w:outlineLvl w:val="0"/>
-            </w:pPr>
-          </w:p>
-        </w:tc>
-        <w:tc>
-          <w:tcPr>
-            <w:tcW w:w="2266" w:type="dxa"/>
-          </w:tcPr>
-          <w:p>
-            <w:pPr>
-              <w:pStyle w:val="berschrift1"/>
-              <w:outlineLvl w:val="0"/>
-            </w:pPr>
-          </w:p>
-        </w:tc>
-        <w:tc>
-          <w:tcPr>
-            <w:tcW w:w="2266" w:type="dxa"/>
-          </w:tcPr>
-          <w:p>
-            <w:pPr>
-              <w:pStyle w:val="berschrift1"/>
-              <w:outlineLvl w:val="0"/>
-            </w:pPr>
+            <w:r>
+              <w:rPr>
+                <w:lang w:val="en-GB"/>
+              </w:rPr>
+              <w:t xml:space="preserve">My </w:t>
+            </w:r>
+            <w:proofErr w:type="spellStart"/>
+            <w:proofErr w:type="gramStart"/>
+            <w:r>
+              <w:rPr>
+                <w:lang w:val="en-GB"/>
+              </w:rPr>
+              <w:t>book.title</w:t>
+            </w:r>
+            <w:proofErr w:type="spellEnd"/>
+            <w:proofErr w:type="gramEnd"/>
           </w:p>
         </w:tc>
       </w:tr>
@@ -472,11 +290,7 @@
       <w:pPr>
         <w:pStyle w:val="berschrift1"/>
       </w:pPr>
-    </w:p>
-    <w:p>
-      <w:pPr>
-        <w:pStyle w:val="berschrift1"/>
-      </w:pPr>
+      <w:bookmarkStart w:id="0" w:name="_Toc224054415"/>
       <w:r>
         <w:lastRenderedPageBreak/>
         <w:t>Kapitel 1:</w:t>
@@ -3901,116 +3715,74 @@
           <w:lang w:val="en-CA"/>
         </w:rPr>
       </w:pPr>
-      <w:proofErr w:type="spellStart"/>
-      <w:r>
-        <w:rPr>
-          <w:lang w:val="en-GB"/>
-        </w:rPr>
+      <w:r>
         <w:t>Standardtext</w:t>
       </w:r>
-      <w:proofErr w:type="spellEnd"/>
-      <w:r>
-        <w:rPr>
-          <w:lang w:val="en-GB"/>
-        </w:rPr>
+      <w:r>
         <w:t xml:space="preserve">: At </w:t>
       </w:r>
       <w:proofErr w:type="spellStart"/>
       <w:r>
-        <w:rPr>
-          <w:lang w:val="en-GB"/>
-        </w:rPr>
         <w:t>vero</w:t>
       </w:r>
       <w:proofErr w:type="spellEnd"/>
       <w:r>
-        <w:rPr>
-          <w:lang w:val="en-GB"/>
-        </w:rPr>
-        <w:t xml:space="preserve"> </w:t>
-      </w:r>
-      <w:proofErr w:type="spellStart"/>
-      <w:r>
-        <w:rPr>
-          <w:lang w:val="en-GB"/>
-        </w:rPr>
+        <w:t xml:space="preserve"> </w:t>
+      </w:r>
+      <w:proofErr w:type="spellStart"/>
+      <w:r>
         <w:t>eos</w:t>
       </w:r>
       <w:proofErr w:type="spellEnd"/>
       <w:r>
-        <w:rPr>
-          <w:lang w:val="en-GB"/>
-        </w:rPr>
         <w:t xml:space="preserve"> et </w:t>
       </w:r>
       <w:proofErr w:type="spellStart"/>
       <w:r>
-        <w:rPr>
-          <w:lang w:val="en-GB"/>
-        </w:rPr>
         <w:t>accusam</w:t>
       </w:r>
       <w:proofErr w:type="spellEnd"/>
       <w:r>
-        <w:rPr>
-          <w:lang w:val="en-GB"/>
-        </w:rPr>
         <w:t xml:space="preserve"> et </w:t>
       </w:r>
       <w:proofErr w:type="spellStart"/>
       <w:r>
-        <w:rPr>
-          <w:lang w:val="en-GB"/>
-        </w:rPr>
         <w:t>justo</w:t>
       </w:r>
       <w:proofErr w:type="spellEnd"/>
       <w:r>
-        <w:rPr>
-          <w:lang w:val="en-GB"/>
-        </w:rPr>
-        <w:t xml:space="preserve"> duo </w:t>
-      </w:r>
-      <w:proofErr w:type="spellStart"/>
-      <w:r>
-        <w:rPr>
-          <w:lang w:val="en-GB"/>
-        </w:rPr>
+        <w:t xml:space="preserve"> </w:t>
+      </w:r>
+      <w:proofErr w:type="spellStart"/>
+      <w:r>
+        <w:t>duo</w:t>
+      </w:r>
+      <w:proofErr w:type="spellEnd"/>
+      <w:r>
+        <w:t xml:space="preserve"> </w:t>
+      </w:r>
+      <w:proofErr w:type="spellStart"/>
+      <w:r>
         <w:t>dolores</w:t>
       </w:r>
       <w:proofErr w:type="spellEnd"/>
       <w:r>
-        <w:rPr>
-          <w:lang w:val="en-GB"/>
-        </w:rPr>
         <w:t xml:space="preserve"> et </w:t>
       </w:r>
       <w:proofErr w:type="spellStart"/>
       <w:r>
-        <w:rPr>
-          <w:lang w:val="en-GB"/>
-        </w:rPr>
         <w:t>ea</w:t>
       </w:r>
       <w:proofErr w:type="spellEnd"/>
       <w:r>
-        <w:rPr>
-          <w:lang w:val="en-GB"/>
-        </w:rPr>
-        <w:t xml:space="preserve"> </w:t>
-      </w:r>
-      <w:proofErr w:type="spellStart"/>
-      <w:r>
-        <w:rPr>
-          <w:lang w:val="en-GB"/>
-        </w:rPr>
+        <w:t xml:space="preserve"> </w:t>
+      </w:r>
+      <w:proofErr w:type="spellStart"/>
+      <w:r>
         <w:t>rebum</w:t>
       </w:r>
       <w:proofErr w:type="spellEnd"/>
       <w:r>
-        <w:rPr>
-          <w:lang w:val="en-GB"/>
-        </w:rPr>
         <w:t xml:space="preserve">. </w:t>
       </w:r>
       <w:r>
@@ -11785,21 +11557,7 @@
         <w:rPr>
           <w:lang w:val="en-CA"/>
         </w:rPr>
-        <w:t xml:space="preserve"> amet. Lorem ipsum dolor sit amet, consetetur sadipscing </w:t>
-      </w:r>
-      <w:proofErr w:type="spellStart"/>
-      <w:r>
-        <w:rPr>
-          <w:lang w:val="en-CA"/>
-        </w:rPr>
-        <w:t>elitr</w:t>
-      </w:r>
-      <w:proofErr w:type="spellEnd"/>
-      <w:r>
-        <w:rPr>
-          <w:lang w:val="en-CA"/>
-        </w:rPr>
-        <w:t xml:space="preserve">, sed diam </w:t>
+        <w:t xml:space="preserve"> amet. Lorem ipsum dolor sit amet, consetetur sadipscing elitr, sed diam </w:t>
       </w:r>
       <w:proofErr w:type="spellStart"/>
       <w:r>
@@ -12568,7 +12326,21 @@
         <w:rPr>
           <w:lang w:val="en-CA"/>
         </w:rPr>
-        <w:t xml:space="preserve"> amet. Lorem ipsum dolor sit amet, consetetur sadipscing </w:t>
+        <w:t xml:space="preserve"> amet. Lorem ipsum dolor sit amet, consetetur sad</w:t>
+      </w:r>
+      <w:proofErr w:type="spellStart"/>
+      <w:r>
+        <w:rPr>
+          <w:lang w:val="en-CA"/>
+        </w:rPr>
+        <w:t>ipscing</w:t>
+      </w:r>
+      <w:proofErr w:type="spellEnd"/>
+      <w:r>
+        <w:rPr>
+          <w:lang w:val="en-CA"/>
+        </w:rPr>
+        <w:t xml:space="preserve"> </w:t>
       </w:r>
       <w:proofErr w:type="spellStart"/>
       <w:r>
@@ -13295,61 +13067,11 @@
           </m:sup>
         </m:sSup>
       </m:oMath>
-      <w:proofErr w:type="spellStart"/>
-      <w:r>
-        <w:rPr>
-          <w:lang w:val="en-CA"/>
-        </w:rPr>
-        <w:t>gubergren</w:t>
-      </w:r>
-      <w:proofErr w:type="spellEnd"/>
-      <w:r>
-        <w:rPr>
-          <w:lang w:val="en-CA"/>
-        </w:rPr>
-        <w:t xml:space="preserve">, no sea </w:t>
-      </w:r>
-      <w:proofErr w:type="spellStart"/>
-      <w:r>
-        <w:rPr>
-          <w:lang w:val="en-CA"/>
-        </w:rPr>
-        <w:t>takimata</w:t>
-      </w:r>
-      <w:proofErr w:type="spellEnd"/>
-      <w:r>
-        <w:rPr>
-          <w:lang w:val="en-CA"/>
-        </w:rPr>
-        <w:t xml:space="preserve"> </w:t>
-      </w:r>
-      <w:proofErr w:type="spellStart"/>
-      <w:r>
-        <w:rPr>
-          <w:lang w:val="en-CA"/>
-        </w:rPr>
-        <w:t>sanctus</w:t>
-      </w:r>
-      <w:proofErr w:type="spellEnd"/>
-      <w:r>
-        <w:rPr>
-          <w:lang w:val="en-CA"/>
-        </w:rPr>
-        <w:t xml:space="preserve"> </w:t>
-      </w:r>
-      <w:proofErr w:type="spellStart"/>
-      <w:r>
-        <w:rPr>
-          <w:lang w:val="en-CA"/>
-        </w:rPr>
-        <w:t>est</w:t>
-      </w:r>
-      <w:proofErr w:type="spellEnd"/>
-      <w:r>
-        <w:rPr>
-          <w:lang w:val="en-CA"/>
-        </w:rPr>
-        <w:t xml:space="preserve"> Lorem ipsum dolor </w:t>
+      <w:r>
+        <w:rPr>
+          <w:lang w:val="en-CA"/>
+        </w:rPr>
+        <w:t xml:space="preserve">gubergren, no sea takimata sanctus est Lorem ipsum dolor </w:t>
       </w:r>
       <w:proofErr w:type="gramStart"/>
       <w:r>
@@ -13363,105 +13085,7 @@
         <w:rPr>
           <w:lang w:val="en-CA"/>
         </w:rPr>
-        <w:t xml:space="preserve"> </w:t>
-      </w:r>
-      <w:proofErr w:type="spellStart"/>
-      <w:r>
-        <w:rPr>
-          <w:lang w:val="en-CA"/>
-        </w:rPr>
-        <w:t>amet</w:t>
-      </w:r>
-      <w:proofErr w:type="spellEnd"/>
-      <w:r>
-        <w:rPr>
-          <w:lang w:val="en-CA"/>
-        </w:rPr>
-        <w:t xml:space="preserve">. Stet </w:t>
-      </w:r>
-      <w:proofErr w:type="spellStart"/>
-      <w:r>
-        <w:rPr>
-          <w:lang w:val="en-CA"/>
-        </w:rPr>
-        <w:t>clita</w:t>
-      </w:r>
-      <w:proofErr w:type="spellEnd"/>
-      <w:r>
-        <w:rPr>
-          <w:lang w:val="en-CA"/>
-        </w:rPr>
-        <w:t xml:space="preserve"> </w:t>
-      </w:r>
-      <w:proofErr w:type="spellStart"/>
-      <w:r>
-        <w:rPr>
-          <w:lang w:val="en-CA"/>
-        </w:rPr>
-        <w:t>kasd</w:t>
-      </w:r>
-      <w:proofErr w:type="spellEnd"/>
-      <w:r>
-        <w:rPr>
-          <w:lang w:val="en-CA"/>
-        </w:rPr>
-        <w:t xml:space="preserve"> </w:t>
-      </w:r>
-      <w:proofErr w:type="spellStart"/>
-      <w:r>
-        <w:rPr>
-          <w:lang w:val="en-CA"/>
-        </w:rPr>
-        <w:t>gubergren</w:t>
-      </w:r>
-      <w:proofErr w:type="spellEnd"/>
-      <w:r>
-        <w:rPr>
-          <w:lang w:val="en-CA"/>
-        </w:rPr>
-        <w:t xml:space="preserve">, no sea </w:t>
-      </w:r>
-      <w:proofErr w:type="spellStart"/>
-      <w:r>
-        <w:rPr>
-          <w:lang w:val="en-CA"/>
-        </w:rPr>
-        <w:t>takimata</w:t>
-      </w:r>
-      <w:proofErr w:type="spellEnd"/>
-      <w:r>
-        <w:rPr>
-          <w:lang w:val="en-CA"/>
-        </w:rPr>
-        <w:t xml:space="preserve"> </w:t>
-      </w:r>
-      <w:proofErr w:type="spellStart"/>
-      <w:r>
-        <w:rPr>
-          <w:lang w:val="en-CA"/>
-        </w:rPr>
-        <w:t>sanctus</w:t>
-      </w:r>
-      <w:proofErr w:type="spellEnd"/>
-      <w:r>
-        <w:rPr>
-          <w:lang w:val="en-CA"/>
-        </w:rPr>
-        <w:t xml:space="preserve"> </w:t>
-      </w:r>
-      <w:proofErr w:type="spellStart"/>
-      <w:r>
-        <w:rPr>
-          <w:lang w:val="en-CA"/>
-        </w:rPr>
-        <w:t>est</w:t>
-      </w:r>
-      <w:proofErr w:type="spellEnd"/>
-      <w:r>
-        <w:rPr>
-          <w:lang w:val="en-CA"/>
-        </w:rPr>
-        <w:t xml:space="preserve"> Lorem ipsum dolor </w:t>
+        <w:t xml:space="preserve"> amet. Stet clita kasd gubergren, no sea takimata sanctus est Lorem ipsum dolor </w:t>
       </w:r>
       <w:proofErr w:type="gramStart"/>
       <w:r>
@@ -13475,126 +13099,14 @@
         <w:rPr>
           <w:lang w:val="en-CA"/>
         </w:rPr>
-        <w:t xml:space="preserve"> </w:t>
-      </w:r>
-      <w:proofErr w:type="spellStart"/>
-      <w:r>
-        <w:rPr>
-          <w:lang w:val="en-CA"/>
-        </w:rPr>
-        <w:t>amet</w:t>
-      </w:r>
-      <w:proofErr w:type="spellEnd"/>
-      <w:r>
-        <w:rPr>
-          <w:lang w:val="en-CA"/>
-        </w:rPr>
-        <w:t xml:space="preserve">. Lorem ipsum dolor sit </w:t>
-      </w:r>
-      <w:proofErr w:type="spellStart"/>
-      <w:r>
-        <w:rPr>
-          <w:lang w:val="en-CA"/>
-        </w:rPr>
-        <w:t>amet</w:t>
-      </w:r>
-      <w:proofErr w:type="spellEnd"/>
-      <w:r>
-        <w:rPr>
-          <w:lang w:val="en-CA"/>
-        </w:rPr>
-        <w:t xml:space="preserve">, </w:t>
-      </w:r>
-      <w:proofErr w:type="spellStart"/>
-      <w:r>
-        <w:rPr>
-          <w:lang w:val="en-CA"/>
-        </w:rPr>
-        <w:t>consetetur</w:t>
-      </w:r>
-      <w:proofErr w:type="spellEnd"/>
-      <w:r>
-        <w:rPr>
-          <w:lang w:val="en-CA"/>
-        </w:rPr>
-        <w:t xml:space="preserve"> </w:t>
-      </w:r>
-      <w:proofErr w:type="spellStart"/>
-      <w:r>
-        <w:rPr>
-          <w:lang w:val="en-CA"/>
-        </w:rPr>
-        <w:t>sadipscing</w:t>
-      </w:r>
-      <w:proofErr w:type="spellEnd"/>
-      <w:r>
-        <w:rPr>
-          <w:lang w:val="en-CA"/>
-        </w:rPr>
-        <w:t xml:space="preserve"> </w:t>
-      </w:r>
-      <w:proofErr w:type="spellStart"/>
-      <w:r>
-        <w:rPr>
-          <w:lang w:val="en-CA"/>
-        </w:rPr>
-        <w:t>elitr</w:t>
-      </w:r>
-      <w:proofErr w:type="spellEnd"/>
-      <w:r>
-        <w:rPr>
-          <w:lang w:val="en-CA"/>
-        </w:rPr>
-        <w:t xml:space="preserve">, sed diam </w:t>
-      </w:r>
-      <w:proofErr w:type="spellStart"/>
-      <w:r>
-        <w:rPr>
-          <w:lang w:val="en-CA"/>
-        </w:rPr>
-        <w:t>nonumy</w:t>
-      </w:r>
-      <w:proofErr w:type="spellEnd"/>
-      <w:r>
-        <w:rPr>
-          <w:lang w:val="en-CA"/>
-        </w:rPr>
-        <w:t xml:space="preserve"> </w:t>
-      </w:r>
-      <w:proofErr w:type="spellStart"/>
-      <w:r>
-        <w:rPr>
-          <w:lang w:val="en-CA"/>
-        </w:rPr>
-        <w:t>eirmod</w:t>
-      </w:r>
-      <w:proofErr w:type="spellEnd"/>
-      <w:r>
-        <w:rPr>
-          <w:lang w:val="en-CA"/>
-        </w:rPr>
-        <w:t xml:space="preserve"> </w:t>
-      </w:r>
-      <w:proofErr w:type="spellStart"/>
-      <w:r>
-        <w:rPr>
-          <w:lang w:val="en-CA"/>
-        </w:rPr>
-        <w:t>tempor</w:t>
-      </w:r>
-      <w:proofErr w:type="spellEnd"/>
-      <w:r>
-        <w:rPr>
-          <w:lang w:val="en-CA"/>
-        </w:rPr>
-        <w:t xml:space="preserve"> </w:t>
-      </w:r>
-      <w:proofErr w:type="spellStart"/>
-      <w:r>
-        <w:rPr>
-          <w:lang w:val="en-CA"/>
-        </w:rPr>
-        <w:t>invidunt</w:t>
+        <w:t xml:space="preserve"> amet. Lorem ipsum dolor sit amet, consetetur sadipscing elitr, sed diam nonumy eirmod tempor invi</w:t>
+      </w:r>
+      <w:proofErr w:type="spellStart"/>
+      <w:r>
+        <w:rPr>
+          <w:lang w:val="en-CA"/>
+        </w:rPr>
+        <w:t>dunt</w:t>
       </w:r>
       <w:proofErr w:type="spellEnd"/>
       <w:r>
@@ -15059,7 +14571,49 @@
           <w:lang w:val="en-CA"/>
         </w:rPr>
         <w:lastRenderedPageBreak/>
-        <w:t xml:space="preserve">nonumy eirmod tempor invidunt ut labore et dolore magna </w:t>
+        <w:t xml:space="preserve">nonumy eirmod </w:t>
+      </w:r>
+      <w:proofErr w:type="spellStart"/>
+      <w:r>
+        <w:rPr>
+          <w:lang w:val="en-CA"/>
+        </w:rPr>
+        <w:t>tempor</w:t>
+      </w:r>
+      <w:proofErr w:type="spellEnd"/>
+      <w:r>
+        <w:rPr>
+          <w:lang w:val="en-CA"/>
+        </w:rPr>
+        <w:t xml:space="preserve"> </w:t>
+      </w:r>
+      <w:proofErr w:type="spellStart"/>
+      <w:r>
+        <w:rPr>
+          <w:lang w:val="en-CA"/>
+        </w:rPr>
+        <w:t>invidunt</w:t>
+      </w:r>
+      <w:proofErr w:type="spellEnd"/>
+      <w:r>
+        <w:rPr>
+          <w:lang w:val="en-CA"/>
+        </w:rPr>
+        <w:t xml:space="preserve"> </w:t>
+      </w:r>
+      <w:proofErr w:type="spellStart"/>
+      <w:r>
+        <w:rPr>
+          <w:lang w:val="en-CA"/>
+        </w:rPr>
+        <w:t>ut</w:t>
+      </w:r>
+      <w:proofErr w:type="spellEnd"/>
+      <w:r>
+        <w:rPr>
+          <w:lang w:val="en-CA"/>
+        </w:rPr>
+        <w:t xml:space="preserve"> labore et dolore magna </w:t>
       </w:r>
       <w:proofErr w:type="spellStart"/>
       <w:r>
@@ -19210,14 +18764,14 @@
         <w:rPr>
           <w:lang w:val="en-CA"/>
         </w:rPr>
-        <w:t xml:space="preserve"> amet. Lorem ipsum dolor sit amet, consetetur sadipscing elitr, sed diam </w:t>
-      </w:r>
-      <w:proofErr w:type="spellStart"/>
-      <w:r>
-        <w:rPr>
-          <w:lang w:val="en-CA"/>
-        </w:rPr>
-        <w:t>nonumy</w:t>
+        <w:t xml:space="preserve"> amet. Lorem ipsum dolor sit amet, consetetur sadipscing elitr, sed diam non</w:t>
+      </w:r>
+      <w:proofErr w:type="spellStart"/>
+      <w:r>
+        <w:rPr>
+          <w:lang w:val="en-CA"/>
+        </w:rPr>
+        <w:t>umy</w:t>
       </w:r>
       <w:proofErr w:type="spellEnd"/>
       <w:r>
@@ -20267,116 +19821,71 @@
           <w:lang w:val="en-CA"/>
         </w:rPr>
       </w:pPr>
-      <w:proofErr w:type="spellStart"/>
-      <w:r>
-        <w:rPr>
-          <w:lang w:val="en-GB"/>
-        </w:rPr>
-        <w:t>Standardtext</w:t>
-      </w:r>
-      <w:proofErr w:type="spellEnd"/>
-      <w:r>
-        <w:rPr>
-          <w:lang w:val="en-GB"/>
-        </w:rPr>
-        <w:t xml:space="preserve">: At </w:t>
-      </w:r>
-      <w:proofErr w:type="spellStart"/>
-      <w:r>
-        <w:rPr>
-          <w:lang w:val="en-GB"/>
-        </w:rPr>
+      <w:r>
+        <w:t xml:space="preserve">Standardtext: At </w:t>
+      </w:r>
+      <w:proofErr w:type="spellStart"/>
+      <w:r>
         <w:t>vero</w:t>
       </w:r>
       <w:proofErr w:type="spellEnd"/>
       <w:r>
-        <w:rPr>
-          <w:lang w:val="en-GB"/>
-        </w:rPr>
-        <w:t xml:space="preserve"> </w:t>
-      </w:r>
-      <w:proofErr w:type="spellStart"/>
-      <w:r>
-        <w:rPr>
-          <w:lang w:val="en-GB"/>
-        </w:rPr>
+        <w:t xml:space="preserve"> </w:t>
+      </w:r>
+      <w:proofErr w:type="spellStart"/>
+      <w:r>
         <w:t>eos</w:t>
       </w:r>
       <w:proofErr w:type="spellEnd"/>
       <w:r>
-        <w:rPr>
-          <w:lang w:val="en-GB"/>
-        </w:rPr>
         <w:t xml:space="preserve"> et </w:t>
       </w:r>
       <w:proofErr w:type="spellStart"/>
       <w:r>
-        <w:rPr>
-          <w:lang w:val="en-GB"/>
-        </w:rPr>
         <w:t>accusam</w:t>
       </w:r>
       <w:proofErr w:type="spellEnd"/>
       <w:r>
-        <w:rPr>
-          <w:lang w:val="en-GB"/>
-        </w:rPr>
         <w:t xml:space="preserve"> et </w:t>
       </w:r>
       <w:proofErr w:type="spellStart"/>
       <w:r>
-        <w:rPr>
-          <w:lang w:val="en-GB"/>
-        </w:rPr>
         <w:t>justo</w:t>
       </w:r>
       <w:proofErr w:type="spellEnd"/>
       <w:r>
-        <w:rPr>
-          <w:lang w:val="en-GB"/>
-        </w:rPr>
-        <w:t xml:space="preserve"> duo </w:t>
-      </w:r>
-      <w:proofErr w:type="spellStart"/>
-      <w:r>
-        <w:rPr>
-          <w:lang w:val="en-GB"/>
-        </w:rPr>
+        <w:t xml:space="preserve"> </w:t>
+      </w:r>
+      <w:proofErr w:type="spellStart"/>
+      <w:r>
+        <w:t>duo</w:t>
+      </w:r>
+      <w:proofErr w:type="spellEnd"/>
+      <w:r>
+        <w:t xml:space="preserve"> </w:t>
+      </w:r>
+      <w:proofErr w:type="spellStart"/>
+      <w:r>
         <w:t>dolores</w:t>
       </w:r>
       <w:proofErr w:type="spellEnd"/>
       <w:r>
-        <w:rPr>
-          <w:lang w:val="en-GB"/>
-        </w:rPr>
         <w:t xml:space="preserve"> et </w:t>
       </w:r>
       <w:proofErr w:type="spellStart"/>
       <w:r>
-        <w:rPr>
-          <w:lang w:val="en-GB"/>
-        </w:rPr>
         <w:t>ea</w:t>
       </w:r>
       <w:proofErr w:type="spellEnd"/>
       <w:r>
-        <w:rPr>
-          <w:lang w:val="en-GB"/>
-        </w:rPr>
-        <w:t xml:space="preserve"> </w:t>
-      </w:r>
-      <w:proofErr w:type="spellStart"/>
-      <w:r>
-        <w:rPr>
-          <w:lang w:val="en-GB"/>
-        </w:rPr>
+        <w:t xml:space="preserve"> </w:t>
+      </w:r>
+      <w:proofErr w:type="spellStart"/>
+      <w:r>
         <w:t>rebum</w:t>
       </w:r>
       <w:proofErr w:type="spellEnd"/>
       <w:r>
-        <w:rPr>
-          <w:lang w:val="en-GB"/>
-        </w:rPr>
         <w:t xml:space="preserve">. </w:t>
       </w:r>
       <w:r>
@@ -25503,7 +25012,35 @@
         <w:rPr>
           <w:lang w:val="en-CA"/>
         </w:rPr>
-        <w:t xml:space="preserve"> amet. Stet clita kasd gubergren, no sea takimata sanctus est Lorem ipsum dolor </w:t>
+        <w:t xml:space="preserve"> amet. Stet clita kasd gubergren, no sea takimata </w:t>
+      </w:r>
+      <w:proofErr w:type="spellStart"/>
+      <w:r>
+        <w:rPr>
+          <w:lang w:val="en-CA"/>
+        </w:rPr>
+        <w:t>sanctus</w:t>
+      </w:r>
+      <w:proofErr w:type="spellEnd"/>
+      <w:r>
+        <w:rPr>
+          <w:lang w:val="en-CA"/>
+        </w:rPr>
+        <w:t xml:space="preserve"> </w:t>
+      </w:r>
+      <w:proofErr w:type="spellStart"/>
+      <w:r>
+        <w:rPr>
+          <w:lang w:val="en-CA"/>
+        </w:rPr>
+        <w:t>est</w:t>
+      </w:r>
+      <w:proofErr w:type="spellEnd"/>
+      <w:r>
+        <w:rPr>
+          <w:lang w:val="en-CA"/>
+        </w:rPr>
+        <w:t xml:space="preserve"> Lorem ipsum dolor </w:t>
       </w:r>
       <w:proofErr w:type="gramStart"/>
       <w:r>
@@ -27792,7 +27329,63 @@
         <w:rPr>
           <w:lang w:val="en-CA"/>
         </w:rPr>
-        <w:t xml:space="preserve">gubergren, no sea takimata sanctus est Lorem ipsum dolor </w:t>
+        <w:t>gubergr</w:t>
+      </w:r>
+      <w:proofErr w:type="spellStart"/>
+      <w:r>
+        <w:rPr>
+          <w:lang w:val="en-CA"/>
+        </w:rPr>
+        <w:t>en</w:t>
+      </w:r>
+      <w:proofErr w:type="spellEnd"/>
+      <w:r>
+        <w:rPr>
+          <w:lang w:val="en-CA"/>
+        </w:rPr>
+        <w:t xml:space="preserve">, no sea </w:t>
+      </w:r>
+      <w:proofErr w:type="spellStart"/>
+      <w:r>
+        <w:rPr>
+          <w:lang w:val="en-CA"/>
+        </w:rPr>
+        <w:t>takimata</w:t>
+      </w:r>
+      <w:proofErr w:type="spellEnd"/>
+      <w:r>
+        <w:rPr>
+          <w:lang w:val="en-CA"/>
+        </w:rPr>
+        <w:t xml:space="preserve"> </w:t>
+      </w:r>
+      <w:proofErr w:type="spellStart"/>
+      <w:r>
+        <w:rPr>
+          <w:lang w:val="en-CA"/>
+        </w:rPr>
+        <w:t>sanctus</w:t>
+      </w:r>
+      <w:proofErr w:type="spellEnd"/>
+      <w:r>
+        <w:rPr>
+          <w:lang w:val="en-CA"/>
+        </w:rPr>
+        <w:t xml:space="preserve"> </w:t>
+      </w:r>
+      <w:proofErr w:type="spellStart"/>
+      <w:r>
+        <w:rPr>
+          <w:lang w:val="en-CA"/>
+        </w:rPr>
+        <w:t>est</w:t>
+      </w:r>
+      <w:proofErr w:type="spellEnd"/>
+      <w:r>
+        <w:rPr>
+          <w:lang w:val="en-CA"/>
+        </w:rPr>
+        <w:t xml:space="preserve"> Lorem ipsum dolor </w:t>
       </w:r>
       <w:proofErr w:type="gramStart"/>
       <w:r>
@@ -27806,7 +27399,105 @@
         <w:rPr>
           <w:lang w:val="en-CA"/>
         </w:rPr>
-        <w:t xml:space="preserve"> amet. Stet clita kasd gubergren, no sea takimata sanctus est Lorem ipsum dolor </w:t>
+        <w:t xml:space="preserve"> </w:t>
+      </w:r>
+      <w:proofErr w:type="spellStart"/>
+      <w:r>
+        <w:rPr>
+          <w:lang w:val="en-CA"/>
+        </w:rPr>
+        <w:t>amet</w:t>
+      </w:r>
+      <w:proofErr w:type="spellEnd"/>
+      <w:r>
+        <w:rPr>
+          <w:lang w:val="en-CA"/>
+        </w:rPr>
+        <w:t xml:space="preserve">. Stet </w:t>
+      </w:r>
+      <w:proofErr w:type="spellStart"/>
+      <w:r>
+        <w:rPr>
+          <w:lang w:val="en-CA"/>
+        </w:rPr>
+        <w:t>clita</w:t>
+      </w:r>
+      <w:proofErr w:type="spellEnd"/>
+      <w:r>
+        <w:rPr>
+          <w:lang w:val="en-CA"/>
+        </w:rPr>
+        <w:t xml:space="preserve"> </w:t>
+      </w:r>
+      <w:proofErr w:type="spellStart"/>
+      <w:r>
+        <w:rPr>
+          <w:lang w:val="en-CA"/>
+        </w:rPr>
+        <w:t>kasd</w:t>
+      </w:r>
+      <w:proofErr w:type="spellEnd"/>
+      <w:r>
+        <w:rPr>
+          <w:lang w:val="en-CA"/>
+        </w:rPr>
+        <w:t xml:space="preserve"> </w:t>
+      </w:r>
+      <w:proofErr w:type="spellStart"/>
+      <w:r>
+        <w:rPr>
+          <w:lang w:val="en-CA"/>
+        </w:rPr>
+        <w:t>gubergren</w:t>
+      </w:r>
+      <w:proofErr w:type="spellEnd"/>
+      <w:r>
+        <w:rPr>
+          <w:lang w:val="en-CA"/>
+        </w:rPr>
+        <w:t xml:space="preserve">, no sea </w:t>
+      </w:r>
+      <w:proofErr w:type="spellStart"/>
+      <w:r>
+        <w:rPr>
+          <w:lang w:val="en-CA"/>
+        </w:rPr>
+        <w:t>takimata</w:t>
+      </w:r>
+      <w:proofErr w:type="spellEnd"/>
+      <w:r>
+        <w:rPr>
+          <w:lang w:val="en-CA"/>
+        </w:rPr>
+        <w:t xml:space="preserve"> </w:t>
+      </w:r>
+      <w:proofErr w:type="spellStart"/>
+      <w:r>
+        <w:rPr>
+          <w:lang w:val="en-CA"/>
+        </w:rPr>
+        <w:t>sanctus</w:t>
+      </w:r>
+      <w:proofErr w:type="spellEnd"/>
+      <w:r>
+        <w:rPr>
+          <w:lang w:val="en-CA"/>
+        </w:rPr>
+        <w:t xml:space="preserve"> </w:t>
+      </w:r>
+      <w:proofErr w:type="spellStart"/>
+      <w:r>
+        <w:rPr>
+          <w:lang w:val="en-CA"/>
+        </w:rPr>
+        <w:t>est</w:t>
+      </w:r>
+      <w:proofErr w:type="spellEnd"/>
+      <w:r>
+        <w:rPr>
+          <w:lang w:val="en-CA"/>
+        </w:rPr>
+        <w:t xml:space="preserve"> Lorem ipsum dolor </w:t>
       </w:r>
       <w:proofErr w:type="gramStart"/>
       <w:r>
@@ -27820,7 +27511,147 @@
         <w:rPr>
           <w:lang w:val="en-CA"/>
         </w:rPr>
-        <w:t xml:space="preserve"> amet. Lorem ipsum dolor sit amet, consetetur sadipscing elitr, sed diam nonumy eirmod tempor invidunt ut labore et dolore magna </w:t>
+        <w:t xml:space="preserve"> </w:t>
+      </w:r>
+      <w:proofErr w:type="spellStart"/>
+      <w:r>
+        <w:rPr>
+          <w:lang w:val="en-CA"/>
+        </w:rPr>
+        <w:t>amet</w:t>
+      </w:r>
+      <w:proofErr w:type="spellEnd"/>
+      <w:r>
+        <w:rPr>
+          <w:lang w:val="en-CA"/>
+        </w:rPr>
+        <w:t xml:space="preserve">. Lorem ipsum dolor sit </w:t>
+      </w:r>
+      <w:proofErr w:type="spellStart"/>
+      <w:r>
+        <w:rPr>
+          <w:lang w:val="en-CA"/>
+        </w:rPr>
+        <w:t>amet</w:t>
+      </w:r>
+      <w:proofErr w:type="spellEnd"/>
+      <w:r>
+        <w:rPr>
+          <w:lang w:val="en-CA"/>
+        </w:rPr>
+        <w:t xml:space="preserve">, </w:t>
+      </w:r>
+      <w:proofErr w:type="spellStart"/>
+      <w:r>
+        <w:rPr>
+          <w:lang w:val="en-CA"/>
+        </w:rPr>
+        <w:t>consetetur</w:t>
+      </w:r>
+      <w:proofErr w:type="spellEnd"/>
+      <w:r>
+        <w:rPr>
+          <w:lang w:val="en-CA"/>
+        </w:rPr>
+        <w:t xml:space="preserve"> </w:t>
+      </w:r>
+      <w:proofErr w:type="spellStart"/>
+      <w:r>
+        <w:rPr>
+          <w:lang w:val="en-CA"/>
+        </w:rPr>
+        <w:t>sadipscing</w:t>
+      </w:r>
+      <w:proofErr w:type="spellEnd"/>
+      <w:r>
+        <w:rPr>
+          <w:lang w:val="en-CA"/>
+        </w:rPr>
+        <w:t xml:space="preserve"> </w:t>
+      </w:r>
+      <w:proofErr w:type="spellStart"/>
+      <w:r>
+        <w:rPr>
+          <w:lang w:val="en-CA"/>
+        </w:rPr>
+        <w:t>elitr</w:t>
+      </w:r>
+      <w:proofErr w:type="spellEnd"/>
+      <w:r>
+        <w:rPr>
+          <w:lang w:val="en-CA"/>
+        </w:rPr>
+        <w:t xml:space="preserve">, sed diam </w:t>
+      </w:r>
+      <w:proofErr w:type="spellStart"/>
+      <w:r>
+        <w:rPr>
+          <w:lang w:val="en-CA"/>
+        </w:rPr>
+        <w:t>nonumy</w:t>
+      </w:r>
+      <w:proofErr w:type="spellEnd"/>
+      <w:r>
+        <w:rPr>
+          <w:lang w:val="en-CA"/>
+        </w:rPr>
+        <w:t xml:space="preserve"> </w:t>
+      </w:r>
+      <w:proofErr w:type="spellStart"/>
+      <w:r>
+        <w:rPr>
+          <w:lang w:val="en-CA"/>
+        </w:rPr>
+        <w:t>eirmod</w:t>
+      </w:r>
+      <w:proofErr w:type="spellEnd"/>
+      <w:r>
+        <w:rPr>
+          <w:lang w:val="en-CA"/>
+        </w:rPr>
+        <w:t xml:space="preserve"> </w:t>
+      </w:r>
+      <w:proofErr w:type="spellStart"/>
+      <w:r>
+        <w:rPr>
+          <w:lang w:val="en-CA"/>
+        </w:rPr>
+        <w:t>tempor</w:t>
+      </w:r>
+      <w:proofErr w:type="spellEnd"/>
+      <w:r>
+        <w:rPr>
+          <w:lang w:val="en-CA"/>
+        </w:rPr>
+        <w:t xml:space="preserve"> </w:t>
+      </w:r>
+      <w:proofErr w:type="spellStart"/>
+      <w:r>
+        <w:rPr>
+          <w:lang w:val="en-CA"/>
+        </w:rPr>
+        <w:t>invidunt</w:t>
+      </w:r>
+      <w:proofErr w:type="spellEnd"/>
+      <w:r>
+        <w:rPr>
+          <w:lang w:val="en-CA"/>
+        </w:rPr>
+        <w:t xml:space="preserve"> </w:t>
+      </w:r>
+      <w:proofErr w:type="spellStart"/>
+      <w:r>
+        <w:rPr>
+          <w:lang w:val="en-CA"/>
+        </w:rPr>
+        <w:t>ut</w:t>
+      </w:r>
+      <w:proofErr w:type="spellEnd"/>
+      <w:r>
+        <w:rPr>
+          <w:lang w:val="en-CA"/>
+        </w:rPr>
+        <w:t xml:space="preserve"> labore et dolore magna </w:t>
       </w:r>
       <w:proofErr w:type="spellStart"/>
       <w:r>
@@ -28501,7 +28332,105 @@
         <w:rPr>
           <w:lang w:val="en-CA"/>
         </w:rPr>
-        <w:t xml:space="preserve"> amet. Stet clita kasd gubergren, no sea takimata sanctus est Lorem ipsum dolor </w:t>
+        <w:t xml:space="preserve"> </w:t>
+      </w:r>
+      <w:proofErr w:type="spellStart"/>
+      <w:r>
+        <w:rPr>
+          <w:lang w:val="en-CA"/>
+        </w:rPr>
+        <w:t>amet</w:t>
+      </w:r>
+      <w:proofErr w:type="spellEnd"/>
+      <w:r>
+        <w:rPr>
+          <w:lang w:val="en-CA"/>
+        </w:rPr>
+        <w:t xml:space="preserve">. Stet </w:t>
+      </w:r>
+      <w:proofErr w:type="spellStart"/>
+      <w:r>
+        <w:rPr>
+          <w:lang w:val="en-CA"/>
+        </w:rPr>
+        <w:t>clita</w:t>
+      </w:r>
+      <w:proofErr w:type="spellEnd"/>
+      <w:r>
+        <w:rPr>
+          <w:lang w:val="en-CA"/>
+        </w:rPr>
+        <w:t xml:space="preserve"> </w:t>
+      </w:r>
+      <w:proofErr w:type="spellStart"/>
+      <w:r>
+        <w:rPr>
+          <w:lang w:val="en-CA"/>
+        </w:rPr>
+        <w:t>kasd</w:t>
+      </w:r>
+      <w:proofErr w:type="spellEnd"/>
+      <w:r>
+        <w:rPr>
+          <w:lang w:val="en-CA"/>
+        </w:rPr>
+        <w:t xml:space="preserve"> </w:t>
+      </w:r>
+      <w:proofErr w:type="spellStart"/>
+      <w:r>
+        <w:rPr>
+          <w:lang w:val="en-CA"/>
+        </w:rPr>
+        <w:t>gubergren</w:t>
+      </w:r>
+      <w:proofErr w:type="spellEnd"/>
+      <w:r>
+        <w:rPr>
+          <w:lang w:val="en-CA"/>
+        </w:rPr>
+        <w:t xml:space="preserve">, no sea </w:t>
+      </w:r>
+      <w:proofErr w:type="spellStart"/>
+      <w:r>
+        <w:rPr>
+          <w:lang w:val="en-CA"/>
+        </w:rPr>
+        <w:t>takimata</w:t>
+      </w:r>
+      <w:proofErr w:type="spellEnd"/>
+      <w:r>
+        <w:rPr>
+          <w:lang w:val="en-CA"/>
+        </w:rPr>
+        <w:t xml:space="preserve"> </w:t>
+      </w:r>
+      <w:proofErr w:type="spellStart"/>
+      <w:r>
+        <w:rPr>
+          <w:lang w:val="en-CA"/>
+        </w:rPr>
+        <w:t>sanctus</w:t>
+      </w:r>
+      <w:proofErr w:type="spellEnd"/>
+      <w:r>
+        <w:rPr>
+          <w:lang w:val="en-CA"/>
+        </w:rPr>
+        <w:t xml:space="preserve"> </w:t>
+      </w:r>
+      <w:proofErr w:type="spellStart"/>
+      <w:r>
+        <w:rPr>
+          <w:lang w:val="en-CA"/>
+        </w:rPr>
+        <w:t>est</w:t>
+      </w:r>
+      <w:proofErr w:type="spellEnd"/>
+      <w:r>
+        <w:rPr>
+          <w:lang w:val="en-CA"/>
+        </w:rPr>
+        <w:t xml:space="preserve"> Lorem ipsum dolor </w:t>
       </w:r>
       <w:proofErr w:type="gramStart"/>
       <w:r>
@@ -28515,7 +28444,147 @@
         <w:rPr>
           <w:lang w:val="en-CA"/>
         </w:rPr>
-        <w:t xml:space="preserve"> amet. Lorem ipsum dolor sit amet, consetetur sadipscing elitr, sed diam nonumy eirmod tempor invidunt ut labore et dolore magna </w:t>
+        <w:t xml:space="preserve"> </w:t>
+      </w:r>
+      <w:proofErr w:type="spellStart"/>
+      <w:r>
+        <w:rPr>
+          <w:lang w:val="en-CA"/>
+        </w:rPr>
+        <w:t>amet</w:t>
+      </w:r>
+      <w:proofErr w:type="spellEnd"/>
+      <w:r>
+        <w:rPr>
+          <w:lang w:val="en-CA"/>
+        </w:rPr>
+        <w:t xml:space="preserve">. Lorem ipsum dolor sit </w:t>
+      </w:r>
+      <w:proofErr w:type="spellStart"/>
+      <w:r>
+        <w:rPr>
+          <w:lang w:val="en-CA"/>
+        </w:rPr>
+        <w:t>amet</w:t>
+      </w:r>
+      <w:proofErr w:type="spellEnd"/>
+      <w:r>
+        <w:rPr>
+          <w:lang w:val="en-CA"/>
+        </w:rPr>
+        <w:t xml:space="preserve">, </w:t>
+      </w:r>
+      <w:proofErr w:type="spellStart"/>
+      <w:r>
+        <w:rPr>
+          <w:lang w:val="en-CA"/>
+        </w:rPr>
+        <w:t>consetetur</w:t>
+      </w:r>
+      <w:proofErr w:type="spellEnd"/>
+      <w:r>
+        <w:rPr>
+          <w:lang w:val="en-CA"/>
+        </w:rPr>
+        <w:t xml:space="preserve"> </w:t>
+      </w:r>
+      <w:proofErr w:type="spellStart"/>
+      <w:r>
+        <w:rPr>
+          <w:lang w:val="en-CA"/>
+        </w:rPr>
+        <w:t>sadipscing</w:t>
+      </w:r>
+      <w:proofErr w:type="spellEnd"/>
+      <w:r>
+        <w:rPr>
+          <w:lang w:val="en-CA"/>
+        </w:rPr>
+        <w:t xml:space="preserve"> </w:t>
+      </w:r>
+      <w:proofErr w:type="spellStart"/>
+      <w:r>
+        <w:rPr>
+          <w:lang w:val="en-CA"/>
+        </w:rPr>
+        <w:t>elitr</w:t>
+      </w:r>
+      <w:proofErr w:type="spellEnd"/>
+      <w:r>
+        <w:rPr>
+          <w:lang w:val="en-CA"/>
+        </w:rPr>
+        <w:t xml:space="preserve">, sed diam </w:t>
+      </w:r>
+      <w:proofErr w:type="spellStart"/>
+      <w:r>
+        <w:rPr>
+          <w:lang w:val="en-CA"/>
+        </w:rPr>
+        <w:t>nonumy</w:t>
+      </w:r>
+      <w:proofErr w:type="spellEnd"/>
+      <w:r>
+        <w:rPr>
+          <w:lang w:val="en-CA"/>
+        </w:rPr>
+        <w:t xml:space="preserve"> </w:t>
+      </w:r>
+      <w:proofErr w:type="spellStart"/>
+      <w:r>
+        <w:rPr>
+          <w:lang w:val="en-CA"/>
+        </w:rPr>
+        <w:t>eirmod</w:t>
+      </w:r>
+      <w:proofErr w:type="spellEnd"/>
+      <w:r>
+        <w:rPr>
+          <w:lang w:val="en-CA"/>
+        </w:rPr>
+        <w:t xml:space="preserve"> </w:t>
+      </w:r>
+      <w:proofErr w:type="spellStart"/>
+      <w:r>
+        <w:rPr>
+          <w:lang w:val="en-CA"/>
+        </w:rPr>
+        <w:t>tempor</w:t>
+      </w:r>
+      <w:proofErr w:type="spellEnd"/>
+      <w:r>
+        <w:rPr>
+          <w:lang w:val="en-CA"/>
+        </w:rPr>
+        <w:t xml:space="preserve"> </w:t>
+      </w:r>
+      <w:proofErr w:type="spellStart"/>
+      <w:r>
+        <w:rPr>
+          <w:lang w:val="en-CA"/>
+        </w:rPr>
+        <w:t>invidunt</w:t>
+      </w:r>
+      <w:proofErr w:type="spellEnd"/>
+      <w:r>
+        <w:rPr>
+          <w:lang w:val="en-CA"/>
+        </w:rPr>
+        <w:t xml:space="preserve"> </w:t>
+      </w:r>
+      <w:proofErr w:type="spellStart"/>
+      <w:r>
+        <w:rPr>
+          <w:lang w:val="en-CA"/>
+        </w:rPr>
+        <w:t>ut</w:t>
+      </w:r>
+      <w:proofErr w:type="spellEnd"/>
+      <w:r>
+        <w:rPr>
+          <w:lang w:val="en-CA"/>
+        </w:rPr>
+        <w:t xml:space="preserve"> labore et dolore magna </w:t>
       </w:r>
       <w:proofErr w:type="spellStart"/>
       <w:r>
@@ -29179,91 +29248,7 @@
         <w:rPr>
           <w:lang w:val="en-CA"/>
         </w:rPr>
-        <w:t xml:space="preserve"> </w:t>
-      </w:r>
-      <w:proofErr w:type="spellStart"/>
-      <w:r>
-        <w:rPr>
-          <w:lang w:val="en-CA"/>
-        </w:rPr>
-        <w:t>amet</w:t>
-      </w:r>
-      <w:proofErr w:type="spellEnd"/>
-      <w:r>
-        <w:rPr>
-          <w:lang w:val="en-CA"/>
-        </w:rPr>
-        <w:t xml:space="preserve">. Stet </w:t>
-      </w:r>
-      <w:proofErr w:type="spellStart"/>
-      <w:r>
-        <w:rPr>
-          <w:lang w:val="en-CA"/>
-        </w:rPr>
-        <w:t>clita</w:t>
-      </w:r>
-      <w:proofErr w:type="spellEnd"/>
-      <w:r>
-        <w:rPr>
-          <w:lang w:val="en-CA"/>
-        </w:rPr>
-        <w:t xml:space="preserve"> </w:t>
-      </w:r>
-      <w:proofErr w:type="spellStart"/>
-      <w:r>
-        <w:rPr>
-          <w:lang w:val="en-CA"/>
-        </w:rPr>
-        <w:t>kasd</w:t>
-      </w:r>
-      <w:proofErr w:type="spellEnd"/>
-      <w:r>
-        <w:rPr>
-          <w:lang w:val="en-CA"/>
-        </w:rPr>
-        <w:t xml:space="preserve"> </w:t>
-      </w:r>
-      <w:proofErr w:type="spellStart"/>
-      <w:r>
-        <w:rPr>
-          <w:lang w:val="en-CA"/>
-        </w:rPr>
-        <w:t>gubergren</w:t>
-      </w:r>
-      <w:proofErr w:type="spellEnd"/>
-      <w:r>
-        <w:rPr>
-          <w:lang w:val="en-CA"/>
-        </w:rPr>
-        <w:t xml:space="preserve">, no sea </w:t>
-      </w:r>
-      <w:proofErr w:type="spellStart"/>
-      <w:r>
-        <w:rPr>
-          <w:lang w:val="en-CA"/>
-        </w:rPr>
-        <w:t>takimata</w:t>
-      </w:r>
-      <w:proofErr w:type="spellEnd"/>
-      <w:r>
-        <w:rPr>
-          <w:lang w:val="en-CA"/>
-        </w:rPr>
-        <w:t xml:space="preserve"> </w:t>
-      </w:r>
-      <w:proofErr w:type="spellStart"/>
-      <w:r>
-        <w:rPr>
-          <w:lang w:val="en-CA"/>
-        </w:rPr>
-        <w:t>sanctus</w:t>
-      </w:r>
-      <w:proofErr w:type="spellEnd"/>
-      <w:r>
-        <w:rPr>
-          <w:lang w:val="en-CA"/>
-        </w:rPr>
-        <w:t xml:space="preserve"> </w:t>
+        <w:t xml:space="preserve"> amet. Stet clita kasd gubergren, no sea takimata sanctus </w:t>
       </w:r>
       <w:proofErr w:type="spellStart"/>
       <w:r>
@@ -30092,63 +30077,7 @@
         <w:rPr>
           <w:lang w:val="en-CA"/>
         </w:rPr>
-        <w:t xml:space="preserve"> amet. Stet clita kasd </w:t>
-      </w:r>
-      <w:proofErr w:type="spellStart"/>
-      <w:r>
-        <w:rPr>
-          <w:lang w:val="en-CA"/>
-        </w:rPr>
-        <w:t>gubergren</w:t>
-      </w:r>
-      <w:proofErr w:type="spellEnd"/>
-      <w:r>
-        <w:rPr>
-          <w:lang w:val="en-CA"/>
-        </w:rPr>
-        <w:t xml:space="preserve">, no sea </w:t>
-      </w:r>
-      <w:proofErr w:type="spellStart"/>
-      <w:r>
-        <w:rPr>
-          <w:lang w:val="en-CA"/>
-        </w:rPr>
-        <w:t>takimata</w:t>
-      </w:r>
-      <w:proofErr w:type="spellEnd"/>
-      <w:r>
-        <w:rPr>
-          <w:lang w:val="en-CA"/>
-        </w:rPr>
-        <w:t xml:space="preserve"> </w:t>
-      </w:r>
-      <w:proofErr w:type="spellStart"/>
-      <w:r>
-        <w:rPr>
-          <w:lang w:val="en-CA"/>
-        </w:rPr>
-        <w:t>sanctus</w:t>
-      </w:r>
-      <w:proofErr w:type="spellEnd"/>
-      <w:r>
-        <w:rPr>
-          <w:lang w:val="en-CA"/>
-        </w:rPr>
-        <w:t xml:space="preserve"> </w:t>
-      </w:r>
-      <w:proofErr w:type="spellStart"/>
-      <w:r>
-        <w:rPr>
-          <w:lang w:val="en-CA"/>
-        </w:rPr>
-        <w:t>est</w:t>
-      </w:r>
-      <w:proofErr w:type="spellEnd"/>
-      <w:r>
-        <w:rPr>
-          <w:lang w:val="en-CA"/>
-        </w:rPr>
-        <w:t xml:space="preserve"> Lorem ipsum dolor </w:t>
+        <w:t xml:space="preserve"> amet. Stet clita kasd gubergren, no sea takimata sanctus est Lorem ipsum dolor </w:t>
       </w:r>
       <w:proofErr w:type="gramStart"/>
       <w:r>
@@ -30162,21 +30091,7 @@
         <w:rPr>
           <w:lang w:val="en-CA"/>
         </w:rPr>
-        <w:t xml:space="preserve"> </w:t>
-      </w:r>
-      <w:proofErr w:type="spellStart"/>
-      <w:r>
-        <w:rPr>
-          <w:lang w:val="en-CA"/>
-        </w:rPr>
-        <w:t>amet</w:t>
-      </w:r>
-      <w:proofErr w:type="spellEnd"/>
-      <w:r>
-        <w:rPr>
-          <w:lang w:val="en-CA"/>
-        </w:rPr>
-        <w:t xml:space="preserve">. Lorem ipsum dolor sit </w:t>
+        <w:t xml:space="preserve"> amet. Lorem ipsum dolor sit </w:t>
       </w:r>
       <w:proofErr w:type="spellStart"/>
       <w:r>
@@ -31732,63 +31647,7 @@
         <w:rPr>
           <w:lang w:val="en-CA"/>
         </w:rPr>
-        <w:t xml:space="preserve"> amet. Stet clita kasd </w:t>
-      </w:r>
-      <w:proofErr w:type="spellStart"/>
-      <w:r>
-        <w:rPr>
-          <w:lang w:val="en-CA"/>
-        </w:rPr>
-        <w:t>gubergren</w:t>
-      </w:r>
-      <w:proofErr w:type="spellEnd"/>
-      <w:r>
-        <w:rPr>
-          <w:lang w:val="en-CA"/>
-        </w:rPr>
-        <w:t xml:space="preserve">, no sea </w:t>
-      </w:r>
-      <w:proofErr w:type="spellStart"/>
-      <w:r>
-        <w:rPr>
-          <w:lang w:val="en-CA"/>
-        </w:rPr>
-        <w:t>takimata</w:t>
-      </w:r>
-      <w:proofErr w:type="spellEnd"/>
-      <w:r>
-        <w:rPr>
-          <w:lang w:val="en-CA"/>
-        </w:rPr>
-        <w:t xml:space="preserve"> </w:t>
-      </w:r>
-      <w:proofErr w:type="spellStart"/>
-      <w:r>
-        <w:rPr>
-          <w:lang w:val="en-CA"/>
-        </w:rPr>
-        <w:t>sanctus</w:t>
-      </w:r>
-      <w:proofErr w:type="spellEnd"/>
-      <w:r>
-        <w:rPr>
-          <w:lang w:val="en-CA"/>
-        </w:rPr>
-        <w:t xml:space="preserve"> </w:t>
-      </w:r>
-      <w:proofErr w:type="spellStart"/>
-      <w:r>
-        <w:rPr>
-          <w:lang w:val="en-CA"/>
-        </w:rPr>
-        <w:t>est</w:t>
-      </w:r>
-      <w:proofErr w:type="spellEnd"/>
-      <w:r>
-        <w:rPr>
-          <w:lang w:val="en-CA"/>
-        </w:rPr>
-        <w:t xml:space="preserve"> Lorem ipsum dolor </w:t>
+        <w:t xml:space="preserve"> amet. Stet clita kasd gubergren, no sea takimata sanctus est Lorem ipsum dolor </w:t>
       </w:r>
       <w:proofErr w:type="gramStart"/>
       <w:r>
@@ -31802,21 +31661,21 @@
         <w:rPr>
           <w:lang w:val="en-CA"/>
         </w:rPr>
-        <w:t xml:space="preserve"> </w:t>
-      </w:r>
-      <w:proofErr w:type="spellStart"/>
-      <w:r>
-        <w:rPr>
-          <w:lang w:val="en-CA"/>
-        </w:rPr>
-        <w:t>amet</w:t>
-      </w:r>
-      <w:proofErr w:type="spellEnd"/>
-      <w:r>
-        <w:rPr>
-          <w:lang w:val="en-CA"/>
-        </w:rPr>
-        <w:t xml:space="preserve">. Lorem ipsum dolor sit </w:t>
+        <w:t xml:space="preserve"> amet. Lorem i</w:t>
+      </w:r>
+      <w:proofErr w:type="spellStart"/>
+      <w:r>
+        <w:rPr>
+          <w:lang w:val="en-CA"/>
+        </w:rPr>
+        <w:t>psum</w:t>
+      </w:r>
+      <w:proofErr w:type="spellEnd"/>
+      <w:r>
+        <w:rPr>
+          <w:lang w:val="en-CA"/>
+        </w:rPr>
+        <w:t xml:space="preserve"> dolor sit </w:t>
       </w:r>
       <w:proofErr w:type="spellStart"/>
       <w:r>
@@ -33559,7 +33418,35 @@
         <w:rPr>
           <w:lang w:val="en-CA"/>
         </w:rPr>
-        <w:t xml:space="preserve"> amet. Stet clita kasd gubergren, no sea takimata sanctus est Lorem ipsum dolor </w:t>
+        <w:t xml:space="preserve"> amet. Stet clita kasd gubergren, no sea takimata </w:t>
+      </w:r>
+      <w:proofErr w:type="spellStart"/>
+      <w:r>
+        <w:rPr>
+          <w:lang w:val="en-CA"/>
+        </w:rPr>
+        <w:t>sanctus</w:t>
+      </w:r>
+      <w:proofErr w:type="spellEnd"/>
+      <w:r>
+        <w:rPr>
+          <w:lang w:val="en-CA"/>
+        </w:rPr>
+        <w:t xml:space="preserve"> </w:t>
+      </w:r>
+      <w:proofErr w:type="spellStart"/>
+      <w:r>
+        <w:rPr>
+          <w:lang w:val="en-CA"/>
+        </w:rPr>
+        <w:t>est</w:t>
+      </w:r>
+      <w:proofErr w:type="spellEnd"/>
+      <w:r>
+        <w:rPr>
+          <w:lang w:val="en-CA"/>
+        </w:rPr>
+        <w:t xml:space="preserve"> Lorem ipsum dolor </w:t>
       </w:r>
       <w:proofErr w:type="gramStart"/>
       <w:r>
@@ -33573,7 +33460,21 @@
         <w:rPr>
           <w:lang w:val="en-CA"/>
         </w:rPr>
-        <w:t xml:space="preserve"> amet. Lorem ipsum dolor sit </w:t>
+        <w:t xml:space="preserve"> </w:t>
+      </w:r>
+      <w:proofErr w:type="spellStart"/>
+      <w:r>
+        <w:rPr>
+          <w:lang w:val="en-CA"/>
+        </w:rPr>
+        <w:t>amet</w:t>
+      </w:r>
+      <w:proofErr w:type="spellEnd"/>
+      <w:r>
+        <w:rPr>
+          <w:lang w:val="en-CA"/>
+        </w:rPr>
+        <w:t xml:space="preserve">. Lorem ipsum dolor sit </w:t>
       </w:r>
       <w:proofErr w:type="spellStart"/>
       <w:r>
@@ -35967,7 +35868,63 @@
         <w:rPr>
           <w:lang w:val="en-CA"/>
         </w:rPr>
-        <w:t xml:space="preserve"> amet. Stet clita kasd gubergren, no sea </w:t>
+        <w:t xml:space="preserve"> </w:t>
+      </w:r>
+      <w:proofErr w:type="spellStart"/>
+      <w:r>
+        <w:rPr>
+          <w:lang w:val="en-CA"/>
+        </w:rPr>
+        <w:t>amet</w:t>
+      </w:r>
+      <w:proofErr w:type="spellEnd"/>
+      <w:r>
+        <w:rPr>
+          <w:lang w:val="en-CA"/>
+        </w:rPr>
+        <w:t xml:space="preserve">. Stet </w:t>
+      </w:r>
+      <w:proofErr w:type="spellStart"/>
+      <w:r>
+        <w:rPr>
+          <w:lang w:val="en-CA"/>
+        </w:rPr>
+        <w:t>clita</w:t>
+      </w:r>
+      <w:proofErr w:type="spellEnd"/>
+      <w:r>
+        <w:rPr>
+          <w:lang w:val="en-CA"/>
+        </w:rPr>
+        <w:t xml:space="preserve"> </w:t>
+      </w:r>
+      <w:proofErr w:type="spellStart"/>
+      <w:r>
+        <w:rPr>
+          <w:lang w:val="en-CA"/>
+        </w:rPr>
+        <w:t>kasd</w:t>
+      </w:r>
+      <w:proofErr w:type="spellEnd"/>
+      <w:r>
+        <w:rPr>
+          <w:lang w:val="en-CA"/>
+        </w:rPr>
+        <w:t xml:space="preserve"> </w:t>
+      </w:r>
+      <w:proofErr w:type="spellStart"/>
+      <w:r>
+        <w:rPr>
+          <w:lang w:val="en-CA"/>
+        </w:rPr>
+        <w:t>gubergren</w:t>
+      </w:r>
+      <w:proofErr w:type="spellEnd"/>
+      <w:r>
+        <w:rPr>
+          <w:lang w:val="en-CA"/>
+        </w:rPr>
+        <w:t xml:space="preserve">, no sea </w:t>
       </w:r>
       <w:proofErr w:type="spellStart"/>
       <w:r>
@@ -37150,116 +37107,71 @@
           <w:lang w:val="en-CA"/>
         </w:rPr>
       </w:pPr>
-      <w:proofErr w:type="spellStart"/>
-      <w:r>
-        <w:rPr>
-          <w:lang w:val="en-GB"/>
-        </w:rPr>
-        <w:t>Standardtext</w:t>
-      </w:r>
-      <w:proofErr w:type="spellEnd"/>
-      <w:r>
-        <w:rPr>
-          <w:lang w:val="en-GB"/>
-        </w:rPr>
-        <w:t xml:space="preserve">: At </w:t>
-      </w:r>
-      <w:proofErr w:type="spellStart"/>
-      <w:r>
-        <w:rPr>
-          <w:lang w:val="en-GB"/>
-        </w:rPr>
+      <w:r>
+        <w:t xml:space="preserve">Standardtext: At </w:t>
+      </w:r>
+      <w:proofErr w:type="spellStart"/>
+      <w:r>
         <w:t>vero</w:t>
       </w:r>
       <w:proofErr w:type="spellEnd"/>
       <w:r>
-        <w:rPr>
-          <w:lang w:val="en-GB"/>
-        </w:rPr>
-        <w:t xml:space="preserve"> </w:t>
-      </w:r>
-      <w:proofErr w:type="spellStart"/>
-      <w:r>
-        <w:rPr>
-          <w:lang w:val="en-GB"/>
-        </w:rPr>
+        <w:t xml:space="preserve"> </w:t>
+      </w:r>
+      <w:proofErr w:type="spellStart"/>
+      <w:r>
         <w:t>eos</w:t>
       </w:r>
       <w:proofErr w:type="spellEnd"/>
       <w:r>
-        <w:rPr>
-          <w:lang w:val="en-GB"/>
-        </w:rPr>
         <w:t xml:space="preserve"> et </w:t>
       </w:r>
       <w:proofErr w:type="spellStart"/>
       <w:r>
-        <w:rPr>
-          <w:lang w:val="en-GB"/>
-        </w:rPr>
         <w:t>accusam</w:t>
       </w:r>
       <w:proofErr w:type="spellEnd"/>
       <w:r>
-        <w:rPr>
-          <w:lang w:val="en-GB"/>
-        </w:rPr>
         <w:t xml:space="preserve"> et </w:t>
       </w:r>
       <w:proofErr w:type="spellStart"/>
       <w:r>
-        <w:rPr>
-          <w:lang w:val="en-GB"/>
-        </w:rPr>
         <w:t>justo</w:t>
       </w:r>
       <w:proofErr w:type="spellEnd"/>
       <w:r>
-        <w:rPr>
-          <w:lang w:val="en-GB"/>
-        </w:rPr>
-        <w:t xml:space="preserve"> duo </w:t>
-      </w:r>
-      <w:proofErr w:type="spellStart"/>
-      <w:r>
-        <w:rPr>
-          <w:lang w:val="en-GB"/>
-        </w:rPr>
+        <w:t xml:space="preserve"> </w:t>
+      </w:r>
+      <w:proofErr w:type="spellStart"/>
+      <w:r>
+        <w:t>duo</w:t>
+      </w:r>
+      <w:proofErr w:type="spellEnd"/>
+      <w:r>
+        <w:t xml:space="preserve"> </w:t>
+      </w:r>
+      <w:proofErr w:type="spellStart"/>
+      <w:r>
         <w:t>dolores</w:t>
       </w:r>
       <w:proofErr w:type="spellEnd"/>
       <w:r>
-        <w:rPr>
-          <w:lang w:val="en-GB"/>
-        </w:rPr>
         <w:t xml:space="preserve"> et </w:t>
       </w:r>
       <w:proofErr w:type="spellStart"/>
       <w:r>
-        <w:rPr>
-          <w:lang w:val="en-GB"/>
-        </w:rPr>
         <w:t>ea</w:t>
       </w:r>
       <w:proofErr w:type="spellEnd"/>
       <w:r>
-        <w:rPr>
-          <w:lang w:val="en-GB"/>
-        </w:rPr>
-        <w:t xml:space="preserve"> </w:t>
-      </w:r>
-      <w:proofErr w:type="spellStart"/>
-      <w:r>
-        <w:rPr>
-          <w:lang w:val="en-GB"/>
-        </w:rPr>
+        <w:t xml:space="preserve"> </w:t>
+      </w:r>
+      <w:proofErr w:type="spellStart"/>
+      <w:r>
         <w:t>rebum</w:t>
       </w:r>
       <w:proofErr w:type="spellEnd"/>
       <w:r>
-        <w:rPr>
-          <w:lang w:val="en-GB"/>
-        </w:rPr>
         <w:t xml:space="preserve">. </w:t>
       </w:r>
       <w:r>
@@ -44965,21 +44877,7 @@
         <w:rPr>
           <w:lang w:val="en-CA"/>
         </w:rPr>
-        <w:t xml:space="preserve"> amet. Lorem ipsum dolor sit amet, consetetur sadipscing </w:t>
-      </w:r>
-      <w:proofErr w:type="spellStart"/>
-      <w:r>
-        <w:rPr>
-          <w:lang w:val="en-CA"/>
-        </w:rPr>
-        <w:t>elitr</w:t>
-      </w:r>
-      <w:proofErr w:type="spellEnd"/>
-      <w:r>
-        <w:rPr>
-          <w:lang w:val="en-CA"/>
-        </w:rPr>
-        <w:t xml:space="preserve">, sed diam </w:t>
+        <w:t xml:space="preserve"> amet. Lorem ipsum dolor sit amet, consetetur sadipscing elitr, sed diam </w:t>
       </w:r>
       <w:proofErr w:type="spellStart"/>
       <w:r>
@@ -49863,21 +49761,7 @@
         <w:rPr>
           <w:lang w:val="en-CA"/>
         </w:rPr>
-        <w:t xml:space="preserve">gubergren, no sea </w:t>
-      </w:r>
-      <w:proofErr w:type="spellStart"/>
-      <w:r>
-        <w:rPr>
-          <w:lang w:val="en-CA"/>
-        </w:rPr>
-        <w:t>takimata</w:t>
-      </w:r>
-      <w:proofErr w:type="spellEnd"/>
-      <w:r>
-        <w:rPr>
-          <w:lang w:val="en-CA"/>
-        </w:rPr>
-        <w:t xml:space="preserve"> </w:t>
+        <w:t xml:space="preserve">gubergren, no sea takimata </w:t>
       </w:r>
       <w:proofErr w:type="spellStart"/>
       <w:r>

</xml_diff>